<commit_message>
Update final project materials
</commit_message>
<xml_diff>
--- a/presentation_script.docx
+++ b/presentation_script.docx
@@ -4,16 +4,12 @@
   <w:body>
     <w:p>
       <w:pPr>
-        <w:spacing w:before="0" w:after="80" w:line="240" w:lineRule="auto"/>
-        <w:pBdr>
-          <w:bottom w:val="single" w:sz="8" w:space="4" w:color="2E74B5"/>
-        </w:pBdr>
+        <w:spacing w:after="40"/>
       </w:pPr>
       <w:r>
         <w:rPr>
-          <w:rFonts w:ascii="Calibri" w:hAnsi="Calibri"/>
           <w:b/>
-          <w:color w:val="1F4D78"/>
+          <w:color w:val="1F4E79"/>
           <w:sz w:val="44"/>
         </w:rPr>
         <w:t>Presentation Script</w:t>
@@ -21,26 +17,28 @@
     </w:p>
     <w:p>
       <w:pPr>
-        <w:spacing w:before="0" w:after="240" w:line="264" w:lineRule="auto"/>
+        <w:spacing w:after="40"/>
       </w:pPr>
       <w:r>
         <w:rPr>
-          <w:color w:val="56657A"/>
-          <w:sz w:val="20"/>
+          <w:b w:val="0"/>
+          <w:color w:val="505050"/>
+          <w:sz w:val="22"/>
         </w:rPr>
         <w:t>Coastal Temperature Prediction | STAT 152 Final Project</w:t>
       </w:r>
     </w:p>
     <w:p>
       <w:pPr>
-        <w:spacing w:before="0" w:after="280" w:line="264" w:lineRule="auto"/>
+        <w:spacing w:after="240"/>
       </w:pPr>
       <w:r>
         <w:rPr>
-          <w:b/>
-          <w:color w:val="202A36"/>
+          <w:b w:val="0"/>
+          <w:color w:val="646464"/>
+          <w:sz w:val="20"/>
         </w:rPr>
-        <w:t>Target timing: about 11 to 12 minutes total, leaving time for Q&amp;A.</w:t>
+        <w:t>Target timing: about 10 to 12 minutes total, leaving time for Q&amp;A.</w:t>
       </w:r>
     </w:p>
     <w:p>
@@ -61,7 +59,7 @@
     </w:p>
     <w:p>
       <w:pPr>
-        <w:spacing w:before="0" w:after="140" w:line="269" w:lineRule="auto"/>
+        <w:spacing w:after="120"/>
       </w:pPr>
       <w:r>
         <w:t>Hi everyone. Our project is about coastal temperature prediction.</w:t>
@@ -69,26 +67,26 @@
     </w:p>
     <w:p>
       <w:pPr>
-        <w:spacing w:before="0" w:after="140" w:line="269" w:lineRule="auto"/>
+        <w:spacing w:after="120"/>
       </w:pPr>
       <w:r>
-        <w:t>The basic question is simple: can current-season climate indices help us predict next-season coastal temperature anomalies?</w:t>
+        <w:t>The question we ask is simple: can climate indices from the current season help predict coastal temperature anomalies in the next season?</w:t>
       </w:r>
     </w:p>
     <w:p>
       <w:pPr>
-        <w:spacing w:before="0" w:after="140" w:line="269" w:lineRule="auto"/>
+        <w:spacing w:after="120"/>
       </w:pPr>
       <w:r>
-        <w:t>We focus on two broad coastal regions, the West Coast and the East Coast. For predictors, we use three climate indices: Nino 3.4, PDO, and AO. After building the lagged dataset, we have 263 one-season-ahead rows.</w:t>
+        <w:t>We compare two broad target regions: the U.S. West Coast and the U.S. East Coast. For predictors, we use Nino 3.4, PDO, and AO. After we line up one predictor season with the following temperature season, the dataset has 263 rows.</w:t>
       </w:r>
     </w:p>
     <w:p>
       <w:pPr>
-        <w:spacing w:before="0" w:after="140" w:line="269" w:lineRule="auto"/>
+        <w:spacing w:after="120"/>
       </w:pPr>
       <w:r>
-        <w:t>The short version of our result is this: there is some signal, but it is not very strong. The signal is clearer for the West Coast, and the model often underpredicts warm seasons in the test period.</w:t>
+        <w:t>The main result is cautious. The indices contain some signal, especially for the West Coast, but the forecast is still weak.</w:t>
       </w:r>
     </w:p>
     <w:p>
@@ -101,7 +99,7 @@
     </w:p>
     <w:p>
       <w:pPr>
-        <w:spacing w:before="0" w:after="140" w:line="269" w:lineRule="auto"/>
+        <w:spacing w:after="120"/>
       </w:pPr>
       <w:r>
         <w:t>Here is the prediction setup.</w:t>
@@ -109,34 +107,34 @@
     </w:p>
     <w:p>
       <w:pPr>
-        <w:spacing w:before="0" w:after="140" w:line="269" w:lineRule="auto"/>
+        <w:spacing w:after="120"/>
       </w:pPr>
       <w:r>
-        <w:t>We do not use the climate index and the temperature anomaly from the same season. That would mostly tell us whether they move together at the same time.</w:t>
+        <w:t>We are not using climate indices from the same season as the target. That would mostly tell us whether variables move together at the same time.</w:t>
       </w:r>
     </w:p>
     <w:p>
       <w:pPr>
-        <w:spacing w:before="0" w:after="140" w:line="269" w:lineRule="auto"/>
+        <w:spacing w:after="120"/>
       </w:pPr>
       <w:r>
-        <w:t>Instead, we use the current season's climate indices to predict the next season's temperature anomaly. So, for example, the current-season Nino 3.4, PDO, and AO values are used to predict the next-season West Coast or East Coast temperature anomaly.</w:t>
+        <w:t>Instead, we use the current season to predict the next season. So the predictors need to carry information forward by one season.</w:t>
       </w:r>
     </w:p>
     <w:p>
       <w:pPr>
-        <w:spacing w:before="0" w:after="140" w:line="269" w:lineRule="auto"/>
+        <w:spacing w:after="120"/>
       </w:pPr>
       <w:r>
-        <w:t>This makes the problem harder, but also more useful. The predictors have to carry information forward.</w:t>
+        <w:t>We also predict anomalies, not raw temperatures. A positive anomaly means warmer than that coast's normal season, and a negative anomaly means cooler than normal.</w:t>
       </w:r>
     </w:p>
     <w:p>
       <w:pPr>
-        <w:spacing w:before="0" w:after="140" w:line="269" w:lineRule="auto"/>
+        <w:spacing w:after="120"/>
       </w:pPr>
       <w:r>
-        <w:t>Also, the target is an anomaly, not raw temperature. So we are predicting whether a season is warmer or cooler than that region's usual seasonal pattern.</w:t>
+        <w:t>We kept the setup small on purpose. That makes the model easier to explain and easier to criticize.</w:t>
       </w:r>
     </w:p>
     <w:p>
@@ -149,42 +147,60 @@
     </w:p>
     <w:p>
       <w:pPr>
-        <w:spacing w:before="0" w:after="140" w:line="269" w:lineRule="auto"/>
+        <w:spacing w:after="120"/>
       </w:pPr>
       <w:r>
-        <w:t>For the temperature data, we use ERA5 monthly 2-meter temperature from 1959 to 2024 on a 1 by 1 degree grid.</w:t>
+        <w:t>For temperature, we use ERA5 monthly 2-meter temperature from 1959 to 2024 on a 1 by 1 degree grid.</w:t>
       </w:r>
     </w:p>
     <w:p>
       <w:pPr>
-        <w:spacing w:before="0" w:after="140" w:line="269" w:lineRule="auto"/>
+        <w:spacing w:after="120"/>
       </w:pPr>
       <w:r>
-        <w:t>We define two regional boxes, one for the West Coast and one for the East Coast. These boxes are broad regional proxies. They are not perfect coastal masks, but they give us a simple and consistent way to compare the two sides of the U.S.</w:t>
+        <w:t>The map boxes are broad regional proxies. They are not perfect land-only coastal masks, but they give us a clear way to compare the two coasts.</w:t>
       </w:r>
     </w:p>
     <w:p>
       <w:pPr>
-        <w:spacing w:before="0" w:after="140" w:line="269" w:lineRule="auto"/>
+        <w:spacing w:after="120"/>
       </w:pPr>
       <w:r>
-        <w:t>For climate predictors, we use Nino 3.4, PDO, and AO. Each season becomes one row in the dataset.</w:t>
+        <w:t>For climate indices, we use monthly Nino 3.4, PDO, and AO data. We convert monthly values into seasonal averages, then make each season one row.</w:t>
       </w:r>
     </w:p>
     <w:p>
       <w:pPr>
-        <w:spacing w:before="0" w:after="140" w:line="269" w:lineRule="auto"/>
+        <w:spacing w:after="120"/>
       </w:pPr>
       <w:r>
-        <w:t>The point of this setup is to keep the project simple and readable. We wanted a clean comparison, not a complicated forecasting system.</w:t>
+        <w:t>With the target and data in place, Person 2 will explain how we prepare the predictors and build the models.</w:t>
       </w:r>
+    </w:p>
+    <w:p>
+      <w:pPr>
+        <w:spacing w:before="120"/>
+      </w:pPr>
+      <w:r>
+        <w:rPr>
+          <w:b/>
+          <w:color w:val="1F4E79"/>
+          <w:sz w:val="20"/>
+        </w:rPr>
+        <w:t>Approximate word count: 279</w:t>
+      </w:r>
+    </w:p>
+    <w:p>
+      <w:pPr>
+        <w:spacing w:after="80"/>
+      </w:pPr>
     </w:p>
     <w:p>
       <w:pPr>
         <w:pStyle w:val="Heading1"/>
       </w:pPr>
       <w:r>
-        <w:t>Person 2: Slides 4-6</w:t>
+        <w:t>Person 2: Slides 4-7</w:t>
       </w:r>
     </w:p>
     <w:p>
@@ -197,34 +213,34 @@
     </w:p>
     <w:p>
       <w:pPr>
-        <w:spacing w:before="0" w:after="140" w:line="269" w:lineRule="auto"/>
+        <w:spacing w:after="120"/>
       </w:pPr>
       <w:r>
-        <w:t>Before modeling, we turn the temperature values into seasonal anomalies.</w:t>
+        <w:t>Before modeling, we turn temperature into seasonal anomalies.</w:t>
       </w:r>
     </w:p>
     <w:p>
       <w:pPr>
-        <w:spacing w:before="0" w:after="140" w:line="269" w:lineRule="auto"/>
+        <w:spacing w:after="120"/>
       </w:pPr>
       <w:r>
-        <w:t>The reason is that raw temperature has a very strong seasonal cycle. Winter and summer are naturally different, so comparing raw temperatures across seasons would not make much sense.</w:t>
+        <w:t>Raw temperature has a strong seasonal cycle. Winter and summer are naturally different, so raw temperatures across seasons are not directly comparable.</w:t>
       </w:r>
     </w:p>
     <w:p>
       <w:pPr>
-        <w:spacing w:before="0" w:after="140" w:line="269" w:lineRule="auto"/>
+        <w:spacing w:after="120"/>
       </w:pPr>
       <w:r>
-        <w:t>Instead, we remove each coast's usual seasonal mean. After that, a positive anomaly means that season was warmer than usual for that coast, and a negative anomaly means it was cooler than usual.</w:t>
+        <w:t>For each coast and each season, we subtract that coast's usual seasonal mean. After this step, the target is centered around normal conditions for that season.</w:t>
       </w:r>
     </w:p>
     <w:p>
       <w:pPr>
-        <w:spacing w:before="0" w:after="140" w:line="269" w:lineRule="auto"/>
+        <w:spacing w:after="120"/>
       </w:pPr>
       <w:r>
-        <w:t>One thing to notice is that the test period has many warm anomalies. That makes it a useful stress test for the model, because the model has to deal with a warmer recent period.</w:t>
+        <w:t>One useful thing about the test period is that it contains many warm anomalies. That makes it a tougher check. A model that mostly learns the older training average may have trouble with those warmer seasons.</w:t>
       </w:r>
     </w:p>
     <w:p>
@@ -237,42 +253,34 @@
     </w:p>
     <w:p>
       <w:pPr>
-        <w:spacing w:before="0" w:after="140" w:line="269" w:lineRule="auto"/>
+        <w:spacing w:after="120"/>
       </w:pPr>
       <w:r>
-        <w:t>These are the three predictors we use.</w:t>
+        <w:t>These are the three predictors.</w:t>
       </w:r>
     </w:p>
     <w:p>
       <w:pPr>
-        <w:spacing w:before="0" w:after="140" w:line="269" w:lineRule="auto"/>
+        <w:spacing w:after="120"/>
       </w:pPr>
       <w:r>
-        <w:t>Nino 3.4 measures tropical Pacific sea surface temperature anomalies. PDO is a North Pacific sea surface pattern. AO is related to Northern Hemisphere atmospheric circulation.</w:t>
+        <w:t>Nino 3.4 measures tropical Pacific sea surface temperature anomalies. PDO describes a North Pacific sea surface pattern. AO is linked to Northern Hemisphere atmospheric circulation.</w:t>
       </w:r>
     </w:p>
     <w:p>
       <w:pPr>
-        <w:spacing w:before="0" w:after="140" w:line="269" w:lineRule="auto"/>
+        <w:spacing w:after="120"/>
       </w:pPr>
       <w:r>
-        <w:t>They are different climate patterns, so in theory they could give us different pieces of information.</w:t>
+        <w:t>We chose them because they come from different parts of the climate system. They are also standard indices, so they are easy to explain and reproduce.</w:t>
       </w:r>
     </w:p>
     <w:p>
       <w:pPr>
-        <w:spacing w:before="0" w:after="140" w:line="269" w:lineRule="auto"/>
+        <w:spacing w:after="120"/>
       </w:pPr>
       <w:r>
-        <w:t>We keep the timing simple. For each predictor, we take the seasonal mean and line it up with the next-season temperature target.</w:t>
-      </w:r>
-    </w:p>
-    <w:p>
-      <w:pPr>
-        <w:spacing w:before="0" w:after="140" w:line="269" w:lineRule="auto"/>
-      </w:pPr>
-      <w:r>
-        <w:t>Again, the goal is not to build the most advanced model possible. The goal is to ask whether these standard climate indices have useful one-season-ahead information.</w:t>
+        <w:t>The timing is the same for all three. We take the seasonal mean of each index, then match it to the next season's coastal temperature anomaly. That keeps the data table simple: one row, one future target, and three possible predictors.</w:t>
       </w:r>
     </w:p>
     <w:p>
@@ -285,42 +293,34 @@
     </w:p>
     <w:p>
       <w:pPr>
-        <w:spacing w:before="0" w:after="140" w:line="269" w:lineRule="auto"/>
+        <w:spacing w:after="120"/>
       </w:pPr>
       <w:r>
-        <w:t>For the model comparison, we use four simple regression setups.</w:t>
+        <w:t>For modeling, we use four plain regression setups.</w:t>
       </w:r>
     </w:p>
     <w:p>
       <w:pPr>
-        <w:spacing w:before="0" w:after="140" w:line="269" w:lineRule="auto"/>
+        <w:spacing w:after="120"/>
       </w:pPr>
       <w:r>
-        <w:t>The baseline model uses only the training mean. Then we add predictors step by step: first Nino 3.4 only, then Nino 3.4 plus PDO, and finally the full model with Nino 3.4, PDO, and AO.</w:t>
+        <w:t>The baseline predicts the training mean only. Then we add predictors step by step: Nino 3.4 only, Nino 3.4 plus PDO, and then the full model with Nino 3.4, PDO, and AO.</w:t>
       </w:r>
     </w:p>
     <w:p>
       <w:pPr>
-        <w:spacing w:before="0" w:after="140" w:line="269" w:lineRule="auto"/>
+        <w:spacing w:after="120"/>
       </w:pPr>
       <w:r>
-        <w:t>We use the same four models for both coasts. That way, the West Coast and East Coast results are directly comparable.</w:t>
+        <w:t>We run the same four models for both coasts. This keeps the comparison fair because the model choices do not change by region.</w:t>
       </w:r>
     </w:p>
     <w:p>
       <w:pPr>
-        <w:spacing w:before="0" w:after="140" w:line="269" w:lineRule="auto"/>
+        <w:spacing w:after="120"/>
       </w:pPr>
       <w:r>
-        <w:t>We also use a time-ordered split. The training set has 210 rows, and the test set has 53 rows. This is important because a random split would mix early and late years together. Since this is a forecasting-style question, the test period should come after the training period.</w:t>
-      </w:r>
-    </w:p>
-    <w:p>
-      <w:pPr>
-        <w:pStyle w:val="Heading1"/>
-      </w:pPr>
-      <w:r>
-        <w:t>Person 3: Slides 7-10</w:t>
+        <w:t>We also use a time-ordered split. The first 210 rows are training data, and the later 53 rows are test data. We do this because the task is closer to forecasting than random prediction. The future period should stay held out.</w:t>
       </w:r>
     </w:p>
     <w:p>
@@ -333,26 +333,68 @@
     </w:p>
     <w:p>
       <w:pPr>
-        <w:spacing w:before="0" w:after="140" w:line="269" w:lineRule="auto"/>
+        <w:spacing w:after="120"/>
       </w:pPr>
       <w:r>
-        <w:t>Before looking at prediction results, we check whether the predictors are too strongly related to each other.</w:t>
+        <w:t>Before interpreting coefficients, we check whether the predictors are too similar.</w:t>
       </w:r>
     </w:p>
     <w:p>
       <w:pPr>
-        <w:spacing w:before="0" w:after="140" w:line="269" w:lineRule="auto"/>
+        <w:spacing w:after="120"/>
       </w:pPr>
       <w:r>
-        <w:t>The correlation heatmap shows that some predictors are related, especially Nino 3.4 and PDO. But the VIF values are all close to 1.</w:t>
+        <w:t>The heatmap shows the strongest relationship is between Nino 3.4 and PDO. That is reasonable because both are connected to Pacific variability.</w:t>
       </w:r>
     </w:p>
     <w:p>
       <w:pPr>
-        <w:spacing w:before="0" w:after="140" w:line="269" w:lineRule="auto"/>
+        <w:spacing w:after="120"/>
       </w:pPr>
       <w:r>
-        <w:t>That means collinearity is low in this simple model. So when we compare the predictors together, we are not dealing with a severe coefficient inflation problem.</w:t>
+        <w:t>The VIF check gives a clearer answer. The VIF values stay close to 1, which means the predictors are not strongly inflated by each other in this dataset.</w:t>
+      </w:r>
+    </w:p>
+    <w:p>
+      <w:pPr>
+        <w:spacing w:after="120"/>
+      </w:pPr>
+      <w:r>
+        <w:t>So we can compare the model versions without worrying too much that collinearity is driving everything.</w:t>
+      </w:r>
+    </w:p>
+    <w:p>
+      <w:pPr>
+        <w:spacing w:after="120"/>
+      </w:pPr>
+      <w:r>
+        <w:t>That is the setup and diagnostic part. Person 3 will cover the held-out results and the final takeaway.</w:t>
+      </w:r>
+    </w:p>
+    <w:p>
+      <w:pPr>
+        <w:spacing w:before="120"/>
+      </w:pPr>
+      <w:r>
+        <w:rPr>
+          <w:b/>
+          <w:color w:val="1F4E79"/>
+          <w:sz w:val="20"/>
+        </w:rPr>
+        <w:t>Approximate word count: 388</w:t>
+      </w:r>
+    </w:p>
+    <w:p>
+      <w:pPr>
+        <w:spacing w:after="80"/>
+      </w:pPr>
+    </w:p>
+    <w:p>
+      <w:pPr>
+        <w:pStyle w:val="Heading1"/>
+      </w:pPr>
+      <w:r>
+        <w:t>Person 3: Slides 8-10</w:t>
       </w:r>
     </w:p>
     <w:p>
@@ -365,34 +407,34 @@
     </w:p>
     <w:p>
       <w:pPr>
-        <w:spacing w:before="0" w:after="140" w:line="269" w:lineRule="auto"/>
+        <w:spacing w:after="120"/>
       </w:pPr>
       <w:r>
-        <w:t>Now we move to out-of-sample prediction.</w:t>
+        <w:t>Now we move from setup to held-out performance.</w:t>
       </w:r>
     </w:p>
     <w:p>
       <w:pPr>
-        <w:spacing w:before="0" w:after="140" w:line="269" w:lineRule="auto"/>
+        <w:spacing w:after="120"/>
       </w:pPr>
       <w:r>
-        <w:t>The main result is that prediction skill is limited. The full model has an RMSE of about 1.115 degrees Celsius for the West Coast and about 1.026 degrees Celsius for the East Coast.</w:t>
+        <w:t>The full model RMSE is about 1.115 degrees Celsius for the West Coast and about 1.026 degrees Celsius for the East Coast. RMSE tells us average prediction error in temperature anomaly units, so smaller is better.</w:t>
       </w:r>
     </w:p>
     <w:p>
       <w:pPr>
-        <w:spacing w:before="0" w:after="140" w:line="269" w:lineRule="auto"/>
+        <w:spacing w:after="120"/>
       </w:pPr>
       <w:r>
-        <w:t>The test R squared values are negative for both coasts. That sounds bad, and honestly it is not a strong forecasting result. It means the models do not beat the simple test-period benchmark in terms of explained variance.</w:t>
+        <w:t>But the more important result is test R squared. It is negative for both coasts: -1.629 for the West Coast and -2.625 for the East Coast.</w:t>
       </w:r>
     </w:p>
     <w:p>
       <w:pPr>
-        <w:spacing w:before="0" w:after="140" w:line="269" w:lineRule="auto"/>
+        <w:spacing w:after="120"/>
       </w:pPr>
       <w:r>
-        <w:t>So the indices add some signal, but the held-out forecast is still weak.</w:t>
+        <w:t>A negative test R squared means the model is worse than using the training mean on the held-out period. So the indices do add some structure, but they do not give a dependable one-season-ahead forecast in this simple setup.</w:t>
       </w:r>
     </w:p>
     <w:p>
@@ -405,34 +447,34 @@
     </w:p>
     <w:p>
       <w:pPr>
-        <w:spacing w:before="0" w:after="140" w:line="269" w:lineRule="auto"/>
+        <w:spacing w:after="120"/>
       </w:pPr>
       <w:r>
-        <w:t>Even though the overall forecast is weak, there is still a regional difference.</w:t>
+        <w:t>The regional comparison is still useful.</w:t>
       </w:r>
     </w:p>
     <w:p>
       <w:pPr>
-        <w:spacing w:before="0" w:after="140" w:line="269" w:lineRule="auto"/>
+        <w:spacing w:after="120"/>
       </w:pPr>
       <w:r>
-        <w:t>The West Coast has a higher test correlation, about 0.363, compared with 0.265 for the East Coast.</w:t>
+        <w:t>The West Coast test correlation is about 0.363, while the East Coast value is about 0.265. Both are modest, but the West Coast result is a little more organized.</w:t>
       </w:r>
     </w:p>
     <w:p>
       <w:pPr>
-        <w:spacing w:before="0" w:after="140" w:line="269" w:lineRule="auto"/>
+        <w:spacing w:after="120"/>
       </w:pPr>
       <w:r>
-        <w:t>In the full model, the West Coast also keeps a clearer Nino 3.4 signal. That makes sense because Pacific conditions are more directly connected to the West Coast.</w:t>
+        <w:t>The full model also keeps a clearer Nino 3.4 signal for the West Coast. That makes physical sense because Pacific conditions are more directly tied to West Coast climate.</w:t>
       </w:r>
     </w:p>
     <w:p>
       <w:pPr>
-        <w:spacing w:before="0" w:after="140" w:line="269" w:lineRule="auto"/>
+        <w:spacing w:after="120"/>
       </w:pPr>
       <w:r>
-        <w:t>For the East Coast, the signal is weaker and less stable. That does not mean there is no climate connection. It just means these three simple indices do not give a strong one-season-ahead forecast for that region.</w:t>
+        <w:t>For the East Coast, the pattern is weaker. That does not mean AO, PDO, or Nino 3.4 never matter there. It only means these three seasonal predictors are not enough for a strong forecast in our test period.</w:t>
       </w:r>
     </w:p>
     <w:p>
@@ -445,48 +487,69 @@
     </w:p>
     <w:p>
       <w:pPr>
-        <w:spacing w:before="0" w:after="140" w:line="269" w:lineRule="auto"/>
+        <w:spacing w:after="120"/>
       </w:pPr>
       <w:r>
-        <w:t>The residual plot helps explain one of the model's main weaknesses.</w:t>
+        <w:t>The residual plot shows the most practical limit.</w:t>
       </w:r>
     </w:p>
     <w:p>
       <w:pPr>
-        <w:spacing w:before="0" w:after="140" w:line="269" w:lineRule="auto"/>
+        <w:spacing w:after="120"/>
       </w:pPr>
       <w:r>
-        <w:t>Here, a positive residual means the observed anomaly is higher than the predicted anomaly. In plain language, the model predicts too cold.</w:t>
+        <w:t>A positive residual means the observed anomaly is higher than the predicted anomaly. In plain language, the model predicts too cold.</w:t>
       </w:r>
     </w:p>
     <w:p>
       <w:pPr>
-        <w:spacing w:before="0" w:after="140" w:line="269" w:lineRule="auto"/>
+        <w:spacing w:after="120"/>
       </w:pPr>
       <w:r>
-        <w:t>During the test period, the mean residual is positive for both coasts: about 0.912 degrees Celsius for the West Coast and 0.884 degrees Celsius for the East Coast.</w:t>
+        <w:t>In the test period, mean residuals are positive for both coasts: about 0.912 degrees Celsius for the West Coast and 0.884 degrees Celsius for the East Coast. So the model misses many warm anomalies.</w:t>
       </w:r>
     </w:p>
     <w:p>
       <w:pPr>
-        <w:spacing w:before="0" w:after="140" w:line="269" w:lineRule="auto"/>
+        <w:spacing w:after="120"/>
       </w:pPr>
       <w:r>
-        <w:t>So our bottom line is this: the climate indices contain some useful information, especially for the West Coast, but the forecast is still weak. The model misses many warm test-period anomalies, which suggests that a simple lagged regression does not fully capture the recent warming pattern.</w:t>
+        <w:t>Our final takeaway is this: climate indices have some useful information, especially for the West Coast, but this small regression model is weak as a forecast.</w:t>
       </w:r>
     </w:p>
     <w:p>
       <w:pPr>
-        <w:spacing w:before="0" w:after="140" w:line="269" w:lineRule="auto"/>
+        <w:spacing w:after="120"/>
+      </w:pPr>
+      <w:r>
+        <w:t>If we continued the project, we would test trend terms, more regional predictors, or more flexible models. For this class project, keeping the model small made the limits easy to see.</w:t>
+      </w:r>
+    </w:p>
+    <w:p>
+      <w:pPr>
+        <w:spacing w:after="120"/>
       </w:pPr>
       <w:r>
         <w:t>Thank you. We are happy to take questions.</w:t>
       </w:r>
     </w:p>
+    <w:p>
+      <w:pPr>
+        <w:spacing w:before="120"/>
+      </w:pPr>
+      <w:r>
+        <w:rPr>
+          <w:b/>
+          <w:color w:val="1F4E79"/>
+          <w:sz w:val="20"/>
+        </w:rPr>
+        <w:t>Approximate word count: 339</w:t>
+      </w:r>
+    </w:p>
     <w:sectPr>
       <w:footerReference w:type="default" r:id="rId9"/>
       <w:pgSz w:w="12240" w:h="15840"/>
-      <w:pgMar w:top="1440" w:right="1440" w:bottom="1440" w:left="1440" w:header="720" w:footer="720" w:gutter="0"/>
+      <w:pgMar w:top="1008" w:right="1152" w:bottom="1008" w:left="1152" w:header="720" w:footer="720" w:gutter="0"/>
       <w:cols w:space="720"/>
       <w:docGrid w:linePitch="360"/>
     </w:sectPr>
@@ -497,15 +560,13 @@
 <file path=word/footer1.xml><?xml version="1.0" encoding="utf-8"?>
 <w:ftr xmlns:m="http://schemas.openxmlformats.org/officeDocument/2006/math" xmlns:mc="http://schemas.openxmlformats.org/markup-compatibility/2006" xmlns:mo="http://schemas.microsoft.com/office/mac/office/2008/main" xmlns:mv="urn:schemas-microsoft-com:mac:vml" xmlns:o="urn:schemas-microsoft-com:office:office" xmlns:r="http://schemas.openxmlformats.org/officeDocument/2006/relationships" xmlns:v="urn:schemas-microsoft-com:vml" xmlns:w10="urn:schemas-microsoft-com:office:word" xmlns:w14="http://schemas.microsoft.com/office/word/2010/wordml" xmlns:w="http://schemas.openxmlformats.org/wordprocessingml/2006/main" xmlns:wne="http://schemas.microsoft.com/office/word/2006/wordml" xmlns:wp14="http://schemas.microsoft.com/office/word/2010/wordprocessingDrawing" xmlns:wp="http://schemas.openxmlformats.org/drawingml/2006/wordprocessingDrawing" xmlns:wpc="http://schemas.microsoft.com/office/word/2010/wordprocessingCanvas" xmlns:wpg="http://schemas.microsoft.com/office/word/2010/wordprocessingGroup" xmlns:wpi="http://schemas.microsoft.com/office/word/2010/wordprocessingInk" xmlns:wps="http://schemas.microsoft.com/office/word/2010/wordprocessingShape" mc:Ignorable="w14 wp14">
   <w:p>
-    <w:pPr>
-      <w:pStyle w:val="Footer"/>
-    </w:pPr>
+    <w:pPr/>
     <w:r>
       <w:rPr>
-        <w:color w:val="6B7280"/>
+        <w:color w:val="787878"/>
         <w:sz w:val="16"/>
       </w:rPr>
-      <w:t>STAT 152 final project | Topic 2</w:t>
+      <w:t>Presentation script | Topic 2</w:t>
     </w:r>
   </w:p>
 </w:ftr>
@@ -875,12 +936,10 @@
     <w:qFormat/>
     <w:rsid w:val="00FC693F"/>
     <w:pPr>
-      <w:spacing w:after="120" w:line="264" w:lineRule="auto"/>
+      <w:spacing w:after="120" w:line="259" w:lineRule="auto"/>
     </w:pPr>
     <w:rPr>
-      <w:rFonts w:ascii="Calibri" w:hAnsi="Calibri"/>
-      <w:b w:val="0"/>
-      <w:color w:val="202A36"/>
+      <w:rFonts w:ascii="Arial" w:hAnsi="Arial"/>
       <w:sz w:val="22"/>
     </w:rPr>
   </w:style>
@@ -939,15 +998,15 @@
     <w:pPr>
       <w:keepNext/>
       <w:keepLines/>
-      <w:spacing w:before="320" w:after="160" w:line="264" w:lineRule="auto"/>
+      <w:spacing w:before="200" w:after="80"/>
       <w:outlineLvl w:val="0"/>
     </w:pPr>
     <w:rPr>
-      <w:rFonts w:asciiTheme="majorHAnsi" w:eastAsiaTheme="majorEastAsia" w:hAnsiTheme="majorHAnsi" w:cstheme="majorBidi" w:ascii="Calibri" w:hAnsi="Calibri"/>
+      <w:rFonts w:asciiTheme="majorHAnsi" w:eastAsiaTheme="majorEastAsia" w:hAnsiTheme="majorHAnsi" w:cstheme="majorBidi" w:ascii="Arial" w:hAnsi="Arial"/>
       <w:b/>
       <w:bCs/>
-      <w:color w:val="2E74B5"/>
-      <w:sz w:val="32"/>
+      <w:color w:val="1F4E79"/>
+      <w:sz w:val="30"/>
       <w:szCs w:val="28"/>
     </w:rPr>
   </w:style>
@@ -963,15 +1022,15 @@
     <w:pPr>
       <w:keepNext/>
       <w:keepLines/>
-      <w:spacing w:before="240" w:after="120" w:line="264" w:lineRule="auto"/>
+      <w:spacing w:before="200" w:after="80"/>
       <w:outlineLvl w:val="1"/>
     </w:pPr>
     <w:rPr>
-      <w:rFonts w:asciiTheme="majorHAnsi" w:eastAsiaTheme="majorEastAsia" w:hAnsiTheme="majorHAnsi" w:cstheme="majorBidi" w:ascii="Calibri" w:hAnsi="Calibri"/>
+      <w:rFonts w:asciiTheme="majorHAnsi" w:eastAsiaTheme="majorEastAsia" w:hAnsiTheme="majorHAnsi" w:cstheme="majorBidi" w:ascii="Arial" w:hAnsi="Arial"/>
       <w:b/>
       <w:bCs/>
-      <w:color w:val="2E74B5"/>
-      <w:sz w:val="26"/>
+      <w:color w:val="444444"/>
+      <w:sz w:val="24"/>
       <w:szCs w:val="26"/>
     </w:rPr>
   </w:style>
@@ -987,14 +1046,15 @@
     <w:pPr>
       <w:keepNext/>
       <w:keepLines/>
-      <w:spacing w:before="200" w:after="0"/>
+      <w:spacing w:before="200" w:after="80"/>
       <w:outlineLvl w:val="2"/>
     </w:pPr>
     <w:rPr>
-      <w:rFonts w:asciiTheme="majorHAnsi" w:eastAsiaTheme="majorEastAsia" w:hAnsiTheme="majorHAnsi" w:cstheme="majorBidi"/>
+      <w:rFonts w:asciiTheme="majorHAnsi" w:eastAsiaTheme="majorEastAsia" w:hAnsiTheme="majorHAnsi" w:cstheme="majorBidi" w:ascii="Arial" w:hAnsi="Arial"/>
       <w:b/>
       <w:bCs/>
-      <w:color w:val="4F81BD" w:themeColor="accent1"/>
+      <w:color w:val="1F4E79"/>
+      <w:sz w:val="22"/>
     </w:rPr>
   </w:style>
   <w:style w:type="paragraph" w:styleId="Heading4">

</xml_diff>